<commit_message>
fix(time): align employee settings with core review
</commit_message>
<xml_diff>
--- a/docs/specifications/LAOO_TIME_FUNCTIONAL_SPEC_AND_ROADMAP.docx
+++ b/docs/specifications/LAOO_TIME_FUNCTIONAL_SPEC_AND_ROADMAP.docx
@@ -157,6 +157,60 @@
       </w:r>
     </w:p>
     <w:p>
+      <w:pPr>
+        <w:pStyle w:val="Heading1"/>
+      </w:pPr>
+      <w:r>
+        <w:t>สถานะการพัฒนาปัจจุบัน 11 กันยายน 2026</w:t>
+      </w:r>
+    </w:p>
+    <w:p>
+      <w:pPr/>
+      <w:r>
+        <w:t>หน้าจอ 28001 พนักงาน ลงเวลาทำงาน เป็นงานจริงในชุด Merge ปัจจุบัน ส่วนหน้าจอ 28002 ยังคงเป็น Preview และงาน 27001 ถึง 27004 ถูกแยกเป็นชุดงานกะและตารางทำงานสำหรับตรวจภายหลัง</w:t>
+      </w:r>
+    </w:p>
+    <w:p>
+      <w:pPr>
+        <w:pStyle w:val="ListBullet"/>
+      </w:pPr>
+      <w:r>
+        <w:t>28001 อ่าน PersonID ฝ่าย แผนก และข้อมูลพนักงานจาก Core แบบ Read only โดยไม่แก้ Employee Person หรือ User ของ Core</w:t>
+      </w:r>
+    </w:p>
+    <w:p>
+      <w:pPr>
+        <w:pStyle w:val="ListBullet"/>
+      </w:pPr>
+      <w:r>
+        <w:t>API รองรับรายการ รายละเอียด และประวัติผ่าน GET employee settings และ GET employee settings employeeId</w:t>
+      </w:r>
+    </w:p>
+    <w:p>
+      <w:pPr>
+        <w:pStyle w:val="ListBullet"/>
+      </w:pPr>
+      <w:r>
+        <w:t>การแก้ไขใช้แผงในหน้าเดียวกัน บังคับ RowVersion เมื่อมีข้อมูลเดิม และสร้าง Version ใหม่พร้อม Immutable Audit Log</w:t>
+      </w:r>
+    </w:p>
+    <w:p>
+      <w:pPr>
+        <w:pStyle w:val="ListBullet"/>
+      </w:pPr>
+      <w:r>
+        <w:t>Business Date และ Time ใช้เวลาไทย UTC บวก 7 ตาม ADR 0062 ส่วนเวลาระบบสำหรับ Audit เก็บเป็น UTC</w:t>
+      </w:r>
+    </w:p>
+    <w:p>
+      <w:pPr>
+        <w:pStyle w:val="ListBullet"/>
+      </w:pPr>
+      <w:r>
+        <w:t>ฐานข้อมูลเป้าหมายคือ DBTDLaooService และ Migration ต้องรันหลัง Core Merge พร้อม Pull main ล่าสุดเท่านั้น</w:t>
+      </w:r>
+    </w:p>
+    <w:p>
       <w:r>
         <w:br w:type="page"/>
       </w:r>
@@ -757,6 +811,9 @@
         </w:rPr>
         <w:t>MenuCode 28002 และ ScreenType 2 เป็นหน้าจอ Company setup ของ LAOO_TIME แยกจาก Company Setup กลาง</w:t>
       </w:r>
+      <w:r>
+        <w:t xml:space="preserve"> สถานะปัจจุบันยังเป็น Preview และไม่เปิด Route หรือ API ในชุด Merge 28001</w:t>
+      </w:r>
     </w:p>
     <w:p>
       <w:pPr>
@@ -2279,21 +2336,7 @@
         <w:ind w:left="397" w:hanging="397"/>
       </w:pPr>
       <w:r>
-        <w:rPr>
-          <w:rFonts w:ascii="Leelawadee UI" w:hAnsi="Leelawadee UI" w:eastAsia="Leelawadee UI"/>
-          <w:b/>
-          <w:color w:val="1D4E79"/>
-          <w:sz w:val="21"/>
-        </w:rPr>
-        <w:t xml:space="preserve">5. หน้ากำหนดค่าระบบเวลา  </w:t>
-      </w:r>
-      <w:r>
-        <w:rPr>
-          <w:rFonts w:ascii="Leelawadee UI" w:hAnsi="Leelawadee UI" w:eastAsia="Leelawadee UI"/>
-          <w:color w:val="000000"/>
-          <w:sz w:val="21"/>
-        </w:rPr>
-        <w:t>พัฒนา Menu 28002 พร้อม API การตรวจ Self service readiness และ Profile version</w:t>
+        <w:t>5. หน้าพนักงานลงเวลาทำงาน  พัฒนา Menu 28001 เป็น Vertical Slice แรก สำหรับ Requirement รหัสที่เครื่อง รายละเอียดและประวัติ</w:t>
       </w:r>
     </w:p>
     <w:p>
@@ -2302,21 +2345,7 @@
         <w:ind w:left="397" w:hanging="397"/>
       </w:pPr>
       <w:r>
-        <w:rPr>
-          <w:rFonts w:ascii="Leelawadee UI" w:hAnsi="Leelawadee UI" w:eastAsia="Leelawadee UI"/>
-          <w:b/>
-          <w:color w:val="1D4E79"/>
-          <w:sz w:val="21"/>
-        </w:rPr>
-        <w:t xml:space="preserve">6. หน้าพนักงานลงเวลาทำงาน  </w:t>
-      </w:r>
-      <w:r>
-        <w:rPr>
-          <w:rFonts w:ascii="Leelawadee UI" w:hAnsi="Leelawadee UI" w:eastAsia="Leelawadee UI"/>
-          <w:color w:val="000000"/>
-          <w:sz w:val="21"/>
-        </w:rPr>
-        <w:t>พัฒนา Menu 28001 สำหรับ Requirement, รหัสที่เครื่อง, ตาราง และงวดของพนักงาน</w:t>
+        <w:t>6. หน้ากำหนดค่าระบบเวลา  คง Menu 28002 เป็น Preview จนกว่าชุด 28001 ผ่านการ Merge และเปิดใช้งาน</w:t>
       </w:r>
     </w:p>
     <w:p>
@@ -2626,11 +2655,6 @@
         <w:ind w:left="369" w:hanging="142"/>
       </w:pPr>
       <w:r>
-        <w:rPr>
-          <w:rFonts w:ascii="Leelawadee UI" w:hAnsi="Leelawadee UI" w:eastAsia="Leelawadee UI"/>
-          <w:color w:val="000000"/>
-          <w:sz w:val="20"/>
-        </w:rPr>
         <w:t>ยืนยัน ProjectCode LAOO_TIME, Menu Group 25 ถึง 30, Menu 28001 และ 28002 แล้ว</w:t>
       </w:r>
     </w:p>
@@ -2641,12 +2665,7 @@
         <w:ind w:left="369" w:hanging="142"/>
       </w:pPr>
       <w:r>
-        <w:rPr>
-          <w:rFonts w:ascii="Leelawadee UI" w:hAnsi="Leelawadee UI" w:eastAsia="Leelawadee UI"/>
-          <w:color w:val="000000"/>
-          <w:sz w:val="20"/>
-        </w:rPr>
-        <w:t>สร้าง Scaffold ฝั่ง Project Time พร้อม Flutter Test และ .NET Build ผ่านแล้ว</w:t>
+        <w:t>Center host รองรับ Project Time และหน้าจอ 28001 มี Flutter, API และการทดสอบแล้ว</w:t>
       </w:r>
     </w:p>
     <w:p>
@@ -2656,12 +2675,7 @@
         <w:ind w:left="369" w:hanging="142"/>
       </w:pPr>
       <w:r>
-        <w:rPr>
-          <w:rFonts w:ascii="Leelawadee UI" w:hAnsi="Leelawadee UI" w:eastAsia="Leelawadee UI"/>
-          <w:color w:val="000000"/>
-          <w:sz w:val="20"/>
-        </w:rPr>
-        <w:t>Bootstrap Data มีอยู่ในฐานข้อมูล แต่เมนูและ Project Menu ยัง Inactive จึงยังไม่แสดงแก่ผู้ใช้</w:t>
+        <w:t>Migration ต้องใช้ฐาน DBTDLaooService หลัง Core Merge และ Pull main ล่าสุด โดยเมนูยัง Inactive ระหว่างตรวจรับ</w:t>
       </w:r>
     </w:p>
     <w:p>
@@ -2671,12 +2685,7 @@
         <w:ind w:left="369" w:hanging="142"/>
       </w:pPr>
       <w:r>
-        <w:rPr>
-          <w:rFonts w:ascii="Leelawadee UI" w:hAnsi="Leelawadee UI" w:eastAsia="Leelawadee UI"/>
-          <w:color w:val="000000"/>
-          <w:sz w:val="20"/>
-        </w:rPr>
-        <w:t>ยังไม่สร้างโครงสร้างธุรกรรมของระบบ Time และยังไม่เปิดเมนูใช้งานจริง</w:t>
+        <w:t>28002 คง Preview และงาน 27001 ถึง 27004 แยกออกจากชุด Merge ของ 28001</w:t>
       </w:r>
     </w:p>
     <w:p>
@@ -2684,21 +2693,7 @@
         <w:spacing w:after="100" w:line="269" w:lineRule="auto"/>
       </w:pPr>
       <w:r>
-        <w:rPr>
-          <w:rFonts w:ascii="Leelawadee UI" w:hAnsi="Leelawadee UI" w:eastAsia="Leelawadee UI"/>
-          <w:b/>
-          <w:color w:val="000000"/>
-          <w:sz w:val="21"/>
-        </w:rPr>
-        <w:t>งานถัดไป</w:t>
-      </w:r>
-      <w:r>
-        <w:rPr>
-          <w:rFonts w:ascii="Leelawadee UI" w:hAnsi="Leelawadee UI" w:eastAsia="Leelawadee UI"/>
-          <w:color w:val="000000"/>
-          <w:sz w:val="21"/>
-        </w:rPr>
-        <w:t>คือให้ Center ผูก Module Time เข้ากับ Host จากนั้นพัฒนา Time foundation และหน้ากำหนดค่าระบบเวลาเป็นลำดับแรก การเปิดเมนูจริงต้องเกิดหลัง Route API Permission และการทดสอบที่เกี่ยวข้องพร้อมครบ</w:t>
+        <w:t>งานถัดไปคือให้ Core ตรวจและ Merge ชุด 28001 จากนั้นรัน Migration ผ่านเครื่องมือกลาง กำหนด Permission และเปิดเมนู 28001 ให้บริษัทนำร่อง ส่วน 28002 และงานกะดำเนินการเป็นชุดถัดไป</w:t>
       </w:r>
     </w:p>
     <w:sectPr>

</xml_diff>